<commit_message>
Swap contract parties: client as Kou, provider as Otsu.
Align md, print HTML, and Word draft while keeping fill-in blanks empty.

Co-authored-by: Cursor <cursoragent@cursor.com>
</commit_message>
<xml_diff>
--- a/docs/利用契約書_草案.docx
+++ b/docs/利用契約書_草案.docx
@@ -5,7 +5,7 @@
     <w:p>
       <w:pPr>
         <w:shd w:val="clear" w:color="auto" w:fill="FFFFFF"/>
-        <w:divId w:val="121844699"/>
+        <w:divId w:val="180512435"/>
         <w:rPr>
           <w:rFonts w:ascii="游ゴシック" w:eastAsia="游ゴシック" w:hAnsi="游ゴシック"/>
           <w:color w:val="111111"/>
@@ -89,7 +89,7 @@
     <w:p>
       <w:pPr>
         <w:shd w:val="clear" w:color="auto" w:fill="F6F6F6"/>
-        <w:divId w:val="2080859276"/>
+        <w:divId w:val="1979603129"/>
         <w:rPr>
           <w:rFonts w:ascii="游ゴシック" w:eastAsia="游ゴシック" w:hAnsi="游ゴシック" w:hint="eastAsia"/>
           <w:color w:val="444444"/>
@@ -153,29 +153,29 @@
     <w:p>
       <w:pPr>
         <w:pStyle w:val="label1"/>
-        <w:divId w:val="2108573988"/>
-        <w:rPr>
-          <w:rFonts w:ascii="游明朝" w:eastAsia="游明朝" w:hAnsi="游明朝" w:hint="eastAsia"/>
-          <w:color w:val="111111"/>
-          <w:sz w:val="19"/>
-          <w:szCs w:val="19"/>
-        </w:rPr>
-      </w:pPr>
-      <w:r>
-        <w:rPr>
-          <w:rFonts w:ascii="游明朝" w:eastAsia="游明朝" w:hAnsi="游明朝" w:hint="eastAsia"/>
-          <w:color w:val="111111"/>
-          <w:sz w:val="19"/>
-          <w:szCs w:val="19"/>
-        </w:rPr>
-        <w:t>甲（提供者）</w:t>
+        <w:divId w:val="1096634552"/>
+        <w:rPr>
+          <w:rFonts w:ascii="游明朝" w:eastAsia="游明朝" w:hAnsi="游明朝" w:hint="eastAsia"/>
+          <w:color w:val="111111"/>
+          <w:sz w:val="19"/>
+          <w:szCs w:val="19"/>
+        </w:rPr>
+      </w:pPr>
+      <w:r>
+        <w:rPr>
+          <w:rFonts w:ascii="游明朝" w:eastAsia="游明朝" w:hAnsi="游明朝" w:hint="eastAsia"/>
+          <w:color w:val="111111"/>
+          <w:sz w:val="19"/>
+          <w:szCs w:val="19"/>
+        </w:rPr>
+        <w:t>甲（利用者）</w:t>
       </w:r>
     </w:p>
     <w:p>
       <w:pPr>
         <w:spacing w:before="30" w:after="30"/>
         <w:jc w:val="both"/>
-        <w:divId w:val="2108573988"/>
+        <w:divId w:val="1096634552"/>
         <w:rPr>
           <w:rFonts w:ascii="游明朝" w:eastAsia="游明朝" w:hAnsi="游明朝" w:hint="eastAsia"/>
           <w:color w:val="111111"/>
@@ -196,29 +196,29 @@
     <w:p>
       <w:pPr>
         <w:pStyle w:val="label1"/>
-        <w:divId w:val="2108573988"/>
-        <w:rPr>
-          <w:rFonts w:ascii="游明朝" w:eastAsia="游明朝" w:hAnsi="游明朝" w:hint="eastAsia"/>
-          <w:color w:val="111111"/>
-          <w:sz w:val="19"/>
-          <w:szCs w:val="19"/>
-        </w:rPr>
-      </w:pPr>
-      <w:r>
-        <w:rPr>
-          <w:rFonts w:ascii="游明朝" w:eastAsia="游明朝" w:hAnsi="游明朝" w:hint="eastAsia"/>
-          <w:color w:val="111111"/>
-          <w:sz w:val="19"/>
-          <w:szCs w:val="19"/>
-        </w:rPr>
-        <w:t>乙（利用者）</w:t>
+        <w:divId w:val="1096634552"/>
+        <w:rPr>
+          <w:rFonts w:ascii="游明朝" w:eastAsia="游明朝" w:hAnsi="游明朝" w:hint="eastAsia"/>
+          <w:color w:val="111111"/>
+          <w:sz w:val="19"/>
+          <w:szCs w:val="19"/>
+        </w:rPr>
+      </w:pPr>
+      <w:r>
+        <w:rPr>
+          <w:rFonts w:ascii="游明朝" w:eastAsia="游明朝" w:hAnsi="游明朝" w:hint="eastAsia"/>
+          <w:color w:val="111111"/>
+          <w:sz w:val="19"/>
+          <w:szCs w:val="19"/>
+        </w:rPr>
+        <w:t>乙（提供者）</w:t>
       </w:r>
     </w:p>
     <w:p>
       <w:pPr>
         <w:spacing w:before="30" w:after="30"/>
         <w:jc w:val="both"/>
-        <w:divId w:val="2108573988"/>
+        <w:divId w:val="1096634552"/>
         <w:rPr>
           <w:rFonts w:ascii="游明朝" w:eastAsia="游明朝" w:hAnsi="游明朝" w:hint="eastAsia"/>
           <w:color w:val="111111"/>
@@ -253,7 +253,7 @@
           <w:sz w:val="19"/>
           <w:szCs w:val="19"/>
         </w:rPr>
-        <w:t>甲および乙は、甲が乙に提供する伝票発行システムおよび入出荷台帳アプリケーション（以下総称して「本システム」という。）の利用等に関し、次のとおり契約（以下「本契約」という。）を締結する。</w:t>
+        <w:t>甲および乙は、乙が甲に提供する伝票発行システムおよび入出荷台帳アプリケーション（以下総称して「本システム」という。）の利用等に関し、次のとおり契約（以下「本契約」という。）を締結する。</w:t>
       </w:r>
     </w:p>
     <w:p>
@@ -303,7 +303,7 @@
           <w:sz w:val="19"/>
           <w:szCs w:val="19"/>
         </w:rPr>
-        <w:t>本契約は、甲が乙に対し本システムの利用を許諾し、初期導入およびサポート等の条件を定めることを目的とする。</w:t>
+        <w:t>本契約は、乙が甲に対し本システムの利用を許諾し、初期導入およびサポート等の条件を定めることを目的とする。</w:t>
       </w:r>
     </w:p>
     <w:p>
@@ -417,7 +417,7 @@
           <w:sz w:val="19"/>
           <w:szCs w:val="19"/>
         </w:rPr>
-        <w:t>「見積書」とは、本契約に先立ち甲が乙に提示した導入費用およびオプション等の見積書類をいう。</w:t>
+        <w:t>「見積書」とは、本契約に先立ち乙が甲に提示した導入費用およびオプション等の見積書類をいう。</w:t>
       </w:r>
     </w:p>
     <w:p>
@@ -441,7 +441,7 @@
           <w:sz w:val="19"/>
           <w:szCs w:val="19"/>
         </w:rPr>
-        <w:t>「注文書」とは、乙が見積書の内容に基づき甲に対して発注の意思を表示する書類（電磁的方法によるものを含む。）をいう。</w:t>
+        <w:t>「注文書」とは、甲が見積書の内容に基づき乙に対して発注の意思を表示する書類（電磁的方法によるものを含む。）をいう。</w:t>
       </w:r>
     </w:p>
     <w:p>
@@ -519,7 +519,7 @@
           <w:sz w:val="19"/>
           <w:szCs w:val="19"/>
         </w:rPr>
-        <w:t>本契約は、乙が甲に対し注文書を交付し、かつ甲乙が本契約の内容に合意し、記名押印（またはこれに準ずる電磁的な合意）をしたときに成立する。</w:t>
+        <w:t>本契約は、甲が乙に対し注文書を交付し、かつ甲乙が本契約の内容に合意し、記名押印（またはこれに準ずる電磁的な合意）をしたときに成立する。</w:t>
       </w:r>
     </w:p>
     <w:p>
@@ -618,7 +618,7 @@
           <w:sz w:val="19"/>
           <w:szCs w:val="19"/>
         </w:rPr>
-        <w:t>甲が乙に納品する物は、次のとおりとする。</w:t>
+        <w:t>乙が甲に納品する物は、次のとおりとする。</w:t>
       </w:r>
     </w:p>
     <w:p>
@@ -806,7 +806,7 @@
           <w:sz w:val="19"/>
           <w:szCs w:val="19"/>
         </w:rPr>
-        <w:t>甲は、前条の納品物の提供が完了したときは、乙に対し納品書を発行する。</w:t>
+        <w:t>乙は、前条の納品物の提供が完了したときは、甲に対し納品書を発行する。</w:t>
       </w:r>
     </w:p>
     <w:p>
@@ -830,7 +830,7 @@
           <w:sz w:val="19"/>
           <w:szCs w:val="19"/>
         </w:rPr>
-        <w:t>乙は、納品書受領後、〔　　〕日以内に本システムの利用可否を確認し、甲に対し確認の結果を通知する。当該期間内に乙から書面（電磁的方法を含む。）による異議がないときは、検収が完了したものとみなす。</w:t>
+        <w:t>甲は、納品書受領後、〔　　〕日以内に本システムの利用可否を確認し、乙に対し確認の結果を通知する。当該期間内に甲から書面（電磁的方法を含む。）による異議がないときは、検収が完了したものとみなす。</w:t>
       </w:r>
     </w:p>
     <w:p>
@@ -878,7 +878,7 @@
           <w:sz w:val="19"/>
           <w:szCs w:val="19"/>
         </w:rPr>
-        <w:t>検収前に発見された本システムの明らかな不具合については、甲が無償で修正する。ただし、乙の指示に基づく仕様変更、乙の環境に起因する事象は、この限りでない。</w:t>
+        <w:t>検収前に発見された本システムの明らかな不具合については、乙が無償で修正する。ただし、甲の指示に基づく仕様変更、甲の環境に起因する事象は、この限りでない。</w:t>
       </w:r>
     </w:p>
     <w:p>
@@ -932,7 +932,7 @@
           <w:sz w:val="19"/>
           <w:szCs w:val="19"/>
         </w:rPr>
-        <w:t>甲は乙に対し、本契約の有効期間中、本システムを乙の業務目的の範囲内で利用することを非独占的に許諾する。</w:t>
+        <w:t>乙は甲に対し、本契約の有効期間中、本システムを甲の業務目的の範囲内で利用することを非独占的に許諾する。</w:t>
       </w:r>
     </w:p>
     <w:p>
@@ -956,7 +956,7 @@
           <w:sz w:val="19"/>
           <w:szCs w:val="19"/>
         </w:rPr>
-        <w:t>利用の範囲は、原則として乙の一法人（一組織）に限る。</w:t>
+        <w:t>利用の範囲は、原則として甲の一法人（一組織）に限る。</w:t>
       </w:r>
     </w:p>
     <w:p>
@@ -980,7 +980,7 @@
           <w:sz w:val="19"/>
           <w:szCs w:val="19"/>
         </w:rPr>
-        <w:t>乙は、本システムを第三者に再販売、再配布、賃貸、貸与し、または利用許諾してはならない。</w:t>
+        <w:t>甲は、本システムを第三者に再販売、再配布、賃貸、貸与し、または利用許諾してはならない。</w:t>
       </w:r>
     </w:p>
     <w:p>
@@ -1004,7 +1004,7 @@
           <w:sz w:val="19"/>
           <w:szCs w:val="19"/>
         </w:rPr>
-        <w:t>本システムに係るログイン情報の管理は、乙の責任において行う。</w:t>
+        <w:t>本システムに係るログイン情報の管理は、甲の責任において行う。</w:t>
       </w:r>
     </w:p>
     <w:p>
@@ -1028,7 +1028,7 @@
           <w:sz w:val="19"/>
           <w:szCs w:val="19"/>
         </w:rPr>
-        <w:t>乙は、伝票等に表示する自社名、住所、連絡先その他の表示内容を、本システム内の設定機能により管理する。当該表示内容の正確性についての責任は、乙が負う。</w:t>
+        <w:t>甲は、伝票等に表示する自社名、住所、連絡先その他の表示内容を、本システム内の設定機能により管理する。当該表示内容の正確性についての責任は、甲が負う。</w:t>
       </w:r>
     </w:p>
     <w:p>
@@ -1082,7 +1082,7 @@
           <w:sz w:val="19"/>
           <w:szCs w:val="19"/>
         </w:rPr>
-        <w:t>乙が甲に支払う対価は、次のとおりとし、金額の詳細は別紙および見積書に定める。</w:t>
+        <w:t>甲が乙に支払う対価は、次のとおりとし、金額の詳細は別紙および見積書に定める。</w:t>
       </w:r>
       <w:r>
         <w:rPr>
@@ -1304,7 +1304,7 @@
           <w:sz w:val="19"/>
           <w:szCs w:val="19"/>
         </w:rPr>
-        <w:t>支払方法は〔銀行振込〕とし、振込手数料は乙の負担とする。振込先は甲が別途指定する。</w:t>
+        <w:t>支払方法は〔銀行振込〕とし、振込手数料は甲の負担とする。振込先は乙が別途指定する。</w:t>
       </w:r>
     </w:p>
     <w:p>
@@ -1376,7 +1376,7 @@
           <w:sz w:val="19"/>
           <w:szCs w:val="19"/>
         </w:rPr>
-        <w:t>クラウド利用料、ドメイン費用その他外部サービスに係る費用は、原則として乙の負担とする。ただし、導入当初に甲が用意するクラウド環境を利用する期間の費用負担は、別紙の定めに従う。</w:t>
+        <w:t>クラウド利用料、ドメイン費用その他外部サービスに係る費用は、原則として甲の負担とする。ただし、導入当初に乙が用意するクラウド環境を利用する期間の費用負担は、別紙の定めに従う。</w:t>
       </w:r>
     </w:p>
     <w:p>
@@ -1454,7 +1454,7 @@
           <w:sz w:val="19"/>
           <w:szCs w:val="19"/>
         </w:rPr>
-        <w:t>乙から追加の要望があった場合、甲は見積を提示し、乙が承諾した範囲において実施する。</w:t>
+        <w:t>甲から追加の要望があった場合、乙は見積を提示し、甲が承諾した範囲において実施する。</w:t>
       </w:r>
     </w:p>
     <w:p>
@@ -1478,7 +1478,7 @@
           <w:sz w:val="19"/>
           <w:szCs w:val="19"/>
         </w:rPr>
-        <w:t>本システムの不具合の修正と、乙の要望に基づく機能追加・仕様変更とは区別して扱う。後者は、原則として有償とする。</w:t>
+        <w:t>本システムの不具合の修正と、甲の要望に基づく機能追加・仕様変更とは区別して扱う。後者は、原則として有償とする。</w:t>
       </w:r>
     </w:p>
     <w:p>
@@ -1532,7 +1532,7 @@
           <w:sz w:val="19"/>
           <w:szCs w:val="19"/>
         </w:rPr>
-        <w:t>甲は、月額サポート料の対象期間中、次の事項に対応する。</w:t>
+        <w:t>乙は、月額サポート料の対象期間中、次の事項に対応する。</w:t>
       </w:r>
       <w:r>
         <w:rPr>
@@ -1706,7 +1706,7 @@
           <w:sz w:val="19"/>
           <w:szCs w:val="19"/>
         </w:rPr>
-        <w:t>乙の使用する端末、プリンタ、ブラウザ、ネットワークその他乙の環境に起因する問題</w:t>
+        <w:t>甲の使用する端末、プリンタ、ブラウザ、ネットワークその他甲の環境に起因する問題</w:t>
       </w:r>
     </w:p>
     <w:p>
@@ -1739,7 +1739,7 @@
           <w:sz w:val="19"/>
           <w:szCs w:val="19"/>
         </w:rPr>
-        <w:t>乙が依頼する仕様変更または追加開発</w:t>
+        <w:t>甲が依頼する仕様変更または追加開発</w:t>
       </w:r>
     </w:p>
     <w:p>
@@ -1772,7 +1772,7 @@
           <w:sz w:val="19"/>
           <w:szCs w:val="19"/>
         </w:rPr>
-        <w:t>乙の操作誤り等によるデータの消失に係る復旧（甲は可能な範囲で協力するが、復旧を保証しない。）</w:t>
+        <w:t>甲の操作誤り等によるデータの消失に係る復旧（乙は可能な範囲で協力するが、復旧を保証しない。）</w:t>
       </w:r>
     </w:p>
     <w:p>
@@ -1850,7 +1850,7 @@
           <w:sz w:val="19"/>
           <w:szCs w:val="19"/>
         </w:rPr>
-        <w:t>本システム上に保存される業務データ（客先、品目、発行履歴等）に関する権利は、乙に帰属する。</w:t>
+        <w:t>本システム上に保存される業務データ（客先、品目、発行履歴等）に関する権利は、甲に帰属する。</w:t>
       </w:r>
     </w:p>
     <w:p>
@@ -1874,7 +1874,7 @@
           <w:sz w:val="19"/>
           <w:szCs w:val="19"/>
         </w:rPr>
-        <w:t>甲は、サポートおよび障害対応に必要な場合を除き、乙のデータを本契約の目的外に利用しない。</w:t>
+        <w:t>乙は、サポートおよび障害対応に必要な場合を除き、甲のデータを本契約の目的外に利用しない。</w:t>
       </w:r>
     </w:p>
     <w:p>
@@ -1898,7 +1898,7 @@
           <w:sz w:val="19"/>
           <w:szCs w:val="19"/>
         </w:rPr>
-        <w:t>乙は、重要データについて、本システムが提供するバックアップ機能等を用い、適宜バックアップを行うものとする。甲は保全に努めるが、完全な保全を保証しない。</w:t>
+        <w:t>甲は、重要データについて、本システムが提供するバックアップ機能等を用い、適宜バックアップを行うものとする。乙は保全に努めるが、完全な保全を保証しない。</w:t>
       </w:r>
     </w:p>
     <w:p>
@@ -1922,7 +1922,7 @@
           <w:sz w:val="19"/>
           <w:szCs w:val="19"/>
         </w:rPr>
-        <w:t>導入当初、本システムのデータは甲が用意するクラウド環境（</w:t>
+        <w:t>導入当初、本システムのデータは乙が用意するクラウド環境（</w:t>
       </w:r>
       <w:r>
         <w:rPr>
@@ -1940,7 +1940,7 @@
           <w:sz w:val="19"/>
           <w:szCs w:val="19"/>
         </w:rPr>
-        <w:t>その他これに準ずるサービスを含む。）に保存する。乙は、利用</w:t>
+        <w:t>その他これに準ずるサービスを含む。）に保存する。甲は、利用</w:t>
       </w:r>
       <w:r>
         <w:rPr>
@@ -1958,7 +1958,7 @@
           <w:sz w:val="19"/>
           <w:szCs w:val="19"/>
         </w:rPr>
-        <w:t>およびログイン情報により本システムを利用でき、乙自身による当該クラウドのアカウント登録は必須としない。</w:t>
+        <w:t>およびログイン情報により本システムを利用でき、甲自身による当該クラウドのアカウント登録は必須としない。</w:t>
       </w:r>
     </w:p>
     <w:p>
@@ -1982,7 +1982,7 @@
           <w:sz w:val="19"/>
           <w:szCs w:val="19"/>
         </w:rPr>
-        <w:t>甲乙合意のうえ、乙が用意するクラウド環境へデータを移管し、接続先を変更することができる。移管の時期、作業範囲および費用は、都度見積または別途合意による。</w:t>
+        <w:t>甲乙合意のうえ、甲が用意するクラウド環境へデータを移管し、接続先を変更することができる。移管の時期、作業範囲および費用は、都度見積または別途合意による。</w:t>
       </w:r>
     </w:p>
     <w:p>
@@ -2006,7 +2006,7 @@
           <w:sz w:val="19"/>
           <w:szCs w:val="19"/>
         </w:rPr>
-        <w:t>本契約終了時、乙から請求があった場合、甲は合理的な範囲でデータのエクスポートおよび移管に協力する。</w:t>
+        <w:t>本契約終了時、甲から請求があった場合、乙は合理的な範囲でデータのエクスポートおよび移管に協力する。</w:t>
       </w:r>
     </w:p>
     <w:p>
@@ -2084,7 +2084,7 @@
           <w:sz w:val="19"/>
           <w:szCs w:val="19"/>
         </w:rPr>
-        <w:t>印刷結果は、プリンタ、ブラウザ、用紙および設定により差異が生じ得る。甲は一般的な案内を行うが、乙の環境における完全な一致を保証しない。</w:t>
+        <w:t>印刷結果は、プリンタ、ブラウザ、用紙および設定により差異が生じ得る。乙は一般的な案内を行うが、甲の環境における完全な一致を保証しない。</w:t>
       </w:r>
     </w:p>
     <w:p>
@@ -2108,7 +2108,7 @@
           <w:sz w:val="19"/>
           <w:szCs w:val="19"/>
         </w:rPr>
-        <w:t>甲の故意または重過失による場合を除き、本契約に関する甲の損害賠償責任は、当該損害発生前</w:t>
+        <w:t>乙の故意または重過失による場合を除き、本契約に関する乙の損害賠償責任は、当該損害発生前</w:t>
       </w:r>
       <w:r>
         <w:rPr>
@@ -2126,7 +2126,7 @@
           <w:sz w:val="19"/>
           <w:szCs w:val="19"/>
         </w:rPr>
-        <w:t>か月間に乙が甲に支払った本契約に係る対価の総額を上限とする。</w:t>
+        <w:t>か月間に甲が乙に支払った本契約に係る対価の総額を上限とする。</w:t>
       </w:r>
     </w:p>
     <w:p>
@@ -2150,7 +2150,7 @@
           <w:sz w:val="19"/>
           <w:szCs w:val="19"/>
         </w:rPr>
-        <w:t>甲は、間接損害、特別損害、逸失利益および乙の取引先との紛争等について、責任を負わない。</w:t>
+        <w:t>乙は、間接損害、特別損害、逸失利益および甲の取引先との紛争等について、責任を負わない。</w:t>
       </w:r>
     </w:p>
     <w:p>
@@ -2296,7 +2296,7 @@
           <w:sz w:val="19"/>
           <w:szCs w:val="19"/>
         </w:rPr>
-        <w:t>本システムの利用許諾は、乙が本システムの利用を終了するまで存続する。</w:t>
+        <w:t>本システムの利用許諾は、甲が本システムの利用を終了するまで存続する。</w:t>
       </w:r>
     </w:p>
     <w:p>
@@ -2344,7 +2344,7 @@
           <w:sz w:val="19"/>
           <w:szCs w:val="19"/>
         </w:rPr>
-        <w:t>乙は、〔　　〕前までに甲へ通知することにより、利用またはサポートを終了することができる。</w:t>
+        <w:t>甲は、〔　　〕前までに乙へ通知することにより、利用またはサポートを終了することができる。</w:t>
       </w:r>
     </w:p>
     <w:p>
@@ -2368,7 +2368,7 @@
           <w:sz w:val="19"/>
           <w:szCs w:val="19"/>
         </w:rPr>
-        <w:t>乙が対価の支払を怠り、または第</w:t>
+        <w:t>甲が対価の支払を怠り、または第</w:t>
       </w:r>
       <w:r>
         <w:rPr>
@@ -2386,7 +2386,7 @@
           <w:sz w:val="19"/>
           <w:szCs w:val="19"/>
         </w:rPr>
-        <w:t>条に違反した場合、甲は本システムの利用停止または本契約の解除を行うことができる。</w:t>
+        <w:t>条に違反した場合、乙は本システムの利用停止または本契約の解除を行うことができる。</w:t>
       </w:r>
     </w:p>
     <w:p>
@@ -2410,7 +2410,7 @@
           <w:sz w:val="19"/>
           <w:szCs w:val="19"/>
         </w:rPr>
-        <w:t>本契約終了後、甲は合理的な期間の経過後、乙向けの利用環境を閉鎖することができる。</w:t>
+        <w:t>本契約終了後、乙は合理的な期間の経過後、甲向けの利用環境を閉鎖することができる。</w:t>
       </w:r>
     </w:p>
     <w:p>
@@ -2488,7 +2488,7 @@
           <w:sz w:val="19"/>
           <w:szCs w:val="19"/>
         </w:rPr>
-        <w:t>協議により解決しない場合、甲の本店所在地を管轄する裁判所を第一審の専属的合意管轄裁判所とする。</w:t>
+        <w:t>協議により解決しない場合、乙の本店所在地を管轄する裁判所を第一審の専属的合意管轄裁判所とする。</w:t>
       </w:r>
     </w:p>
     <w:p>
@@ -2627,7 +2627,7 @@
     </w:p>
     <w:p>
       <w:pPr>
-        <w:divId w:val="1061977797"/>
+        <w:divId w:val="1406759062"/>
         <w:rPr>
           <w:rFonts w:ascii="游明朝" w:eastAsia="游明朝" w:hAnsi="游明朝" w:hint="eastAsia"/>
           <w:b/>
@@ -2646,14 +2646,14 @@
           <w:sz w:val="19"/>
           <w:szCs w:val="19"/>
         </w:rPr>
-        <w:t>甲（提供者）</w:t>
+        <w:t>甲（利用者）</w:t>
       </w:r>
     </w:p>
     <w:p>
       <w:pPr>
         <w:spacing w:before="60" w:after="60"/>
         <w:jc w:val="both"/>
-        <w:divId w:val="478033775"/>
+        <w:divId w:val="846138135"/>
         <w:rPr>
           <w:rFonts w:ascii="游明朝" w:eastAsia="游明朝" w:hAnsi="游明朝" w:hint="eastAsia"/>
           <w:color w:val="111111"/>
@@ -2675,7 +2675,7 @@
       <w:pPr>
         <w:spacing w:before="60" w:after="60"/>
         <w:jc w:val="both"/>
-        <w:divId w:val="478033775"/>
+        <w:divId w:val="846138135"/>
         <w:rPr>
           <w:rFonts w:ascii="游明朝" w:eastAsia="游明朝" w:hAnsi="游明朝" w:hint="eastAsia"/>
           <w:color w:val="111111"/>
@@ -2697,7 +2697,7 @@
       <w:pPr>
         <w:spacing w:before="60" w:after="60"/>
         <w:jc w:val="both"/>
-        <w:divId w:val="478033775"/>
+        <w:divId w:val="846138135"/>
         <w:rPr>
           <w:rFonts w:ascii="游明朝" w:eastAsia="游明朝" w:hAnsi="游明朝" w:hint="eastAsia"/>
           <w:color w:val="111111"/>
@@ -2718,7 +2718,7 @@
     <w:p>
       <w:pPr>
         <w:jc w:val="right"/>
-        <w:divId w:val="1853378673"/>
+        <w:divId w:val="1139229492"/>
         <w:rPr>
           <w:rFonts w:ascii="游明朝" w:eastAsia="游明朝" w:hAnsi="游明朝" w:hint="eastAsia"/>
           <w:color w:val="111111"/>
@@ -2740,7 +2740,7 @@
     </w:p>
     <w:p>
       <w:pPr>
-        <w:divId w:val="1200897356"/>
+        <w:divId w:val="2071417615"/>
         <w:rPr>
           <w:rFonts w:ascii="游明朝" w:eastAsia="游明朝" w:hAnsi="游明朝" w:hint="eastAsia"/>
           <w:b/>
@@ -2759,14 +2759,14 @@
           <w:sz w:val="19"/>
           <w:szCs w:val="19"/>
         </w:rPr>
-        <w:t>乙（利用者）</w:t>
+        <w:t>乙（提供者）</w:t>
       </w:r>
     </w:p>
     <w:p>
       <w:pPr>
         <w:spacing w:before="60" w:after="60"/>
         <w:jc w:val="both"/>
-        <w:divId w:val="1909070337"/>
+        <w:divId w:val="1276475465"/>
         <w:rPr>
           <w:rFonts w:ascii="游明朝" w:eastAsia="游明朝" w:hAnsi="游明朝" w:hint="eastAsia"/>
           <w:color w:val="111111"/>
@@ -2788,7 +2788,7 @@
       <w:pPr>
         <w:spacing w:before="60" w:after="60"/>
         <w:jc w:val="both"/>
-        <w:divId w:val="1909070337"/>
+        <w:divId w:val="1276475465"/>
         <w:rPr>
           <w:rFonts w:ascii="游明朝" w:eastAsia="游明朝" w:hAnsi="游明朝" w:hint="eastAsia"/>
           <w:color w:val="111111"/>
@@ -2810,7 +2810,7 @@
       <w:pPr>
         <w:spacing w:before="60" w:after="60"/>
         <w:jc w:val="both"/>
-        <w:divId w:val="1909070337"/>
+        <w:divId w:val="1276475465"/>
         <w:rPr>
           <w:rFonts w:ascii="游明朝" w:eastAsia="游明朝" w:hAnsi="游明朝" w:hint="eastAsia"/>
           <w:color w:val="111111"/>
@@ -2831,7 +2831,7 @@
     <w:p>
       <w:pPr>
         <w:jc w:val="right"/>
-        <w:divId w:val="454836475"/>
+        <w:divId w:val="218248451"/>
         <w:rPr>
           <w:rFonts w:ascii="游明朝" w:eastAsia="游明朝" w:hAnsi="游明朝" w:hint="eastAsia"/>
           <w:color w:val="111111"/>
@@ -2854,7 +2854,7 @@
     <w:p>
       <w:pPr>
         <w:pStyle w:val="2"/>
-        <w:divId w:val="1870140546"/>
+        <w:divId w:val="519316062"/>
         <w:rPr>
           <w:rFonts w:ascii="游明朝" w:eastAsia="游明朝" w:hAnsi="游明朝" w:hint="eastAsia"/>
           <w:color w:val="111111"/>
@@ -2871,7 +2871,7 @@
     <w:p>
       <w:pPr>
         <w:pStyle w:val="Web"/>
-        <w:divId w:val="1870140546"/>
+        <w:divId w:val="519316062"/>
         <w:rPr>
           <w:rFonts w:ascii="游明朝" w:eastAsia="游明朝" w:hAnsi="游明朝" w:hint="eastAsia"/>
           <w:color w:val="111111"/>
@@ -2906,7 +2906,7 @@
       </w:tblGrid>
       <w:tr>
         <w:trPr>
-          <w:divId w:val="1870140546"/>
+          <w:divId w:val="519316062"/>
         </w:trPr>
         <w:tc>
           <w:tcPr>
@@ -2999,7 +2999,7 @@
       </w:tr>
       <w:tr>
         <w:trPr>
-          <w:divId w:val="1870140546"/>
+          <w:divId w:val="519316062"/>
         </w:trPr>
         <w:tc>
           <w:tcPr>
@@ -3035,7 +3035,7 @@
                 <w:sz w:val="17"/>
                 <w:szCs w:val="17"/>
               </w:rPr>
-              <w:t>利用者（乙）</w:t>
+              <w:t>利用者（甲）</w:t>
             </w:r>
           </w:p>
         </w:tc>
@@ -3080,7 +3080,7 @@
       </w:tr>
       <w:tr>
         <w:trPr>
-          <w:divId w:val="1870140546"/>
+          <w:divId w:val="519316062"/>
         </w:trPr>
         <w:tc>
           <w:tcPr>
@@ -3170,7 +3170,7 @@
       </w:tr>
       <w:tr>
         <w:trPr>
-          <w:divId w:val="1870140546"/>
+          <w:divId w:val="519316062"/>
         </w:trPr>
         <w:tc>
           <w:tcPr>
@@ -3280,7 +3280,7 @@
                 <w:sz w:val="17"/>
                 <w:szCs w:val="17"/>
               </w:rPr>
-              <w:t>読込および手入力（導入後の運用は乙が行う。）、請求系マスタ項目の表示設定（最低保証、配送費等。請求機能利用時）、クラウド保存、</w:t>
+              <w:t>読込および手入力（導入後の運用は甲が行う。）、請求系マスタ項目の表示設定（最低保証、配送費等。請求機能利用時）、クラウド保存、</w:t>
             </w:r>
             <w:r>
               <w:rPr>
@@ -3305,7 +3305,7 @@
       </w:tr>
       <w:tr>
         <w:trPr>
-          <w:divId w:val="1870140546"/>
+          <w:divId w:val="519316062"/>
         </w:trPr>
         <w:tc>
           <w:tcPr>
@@ -3386,7 +3386,7 @@
       </w:tr>
       <w:tr>
         <w:trPr>
-          <w:divId w:val="1870140546"/>
+          <w:divId w:val="519316062"/>
         </w:trPr>
         <w:tc>
           <w:tcPr>
@@ -3476,7 +3476,7 @@
       </w:tr>
       <w:tr>
         <w:trPr>
-          <w:divId w:val="1870140546"/>
+          <w:divId w:val="519316062"/>
         </w:trPr>
         <w:tc>
           <w:tcPr>
@@ -3566,7 +3566,7 @@
       </w:tr>
       <w:tr>
         <w:trPr>
-          <w:divId w:val="1870140546"/>
+          <w:divId w:val="519316062"/>
         </w:trPr>
         <w:tc>
           <w:tcPr>
@@ -3656,7 +3656,7 @@
       </w:tr>
       <w:tr>
         <w:trPr>
-          <w:divId w:val="1870140546"/>
+          <w:divId w:val="519316062"/>
         </w:trPr>
         <w:tc>
           <w:tcPr>
@@ -3746,7 +3746,7 @@
       </w:tr>
       <w:tr>
         <w:trPr>
-          <w:divId w:val="1870140546"/>
+          <w:divId w:val="519316062"/>
         </w:trPr>
         <w:tc>
           <w:tcPr>
@@ -3827,7 +3827,7 @@
       </w:tr>
       <w:tr>
         <w:trPr>
-          <w:divId w:val="1870140546"/>
+          <w:divId w:val="519316062"/>
         </w:trPr>
         <w:tc>
           <w:tcPr>
@@ -3980,7 +3980,7 @@
       </w:tr>
       <w:tr>
         <w:trPr>
-          <w:divId w:val="1870140546"/>
+          <w:divId w:val="519316062"/>
         </w:trPr>
         <w:tc>
           <w:tcPr>
@@ -4097,7 +4097,7 @@
       </w:tr>
       <w:tr>
         <w:trPr>
-          <w:divId w:val="1870140546"/>
+          <w:divId w:val="519316062"/>
         </w:trPr>
         <w:tc>
           <w:tcPr>
@@ -4178,7 +4178,7 @@
       </w:tr>
       <w:tr>
         <w:trPr>
-          <w:divId w:val="1870140546"/>
+          <w:divId w:val="519316062"/>
         </w:trPr>
         <w:tc>
           <w:tcPr>
@@ -4268,7 +4268,7 @@
       </w:tr>
       <w:tr>
         <w:trPr>
-          <w:divId w:val="1870140546"/>
+          <w:divId w:val="519316062"/>
         </w:trPr>
         <w:tc>
           <w:tcPr>
@@ -4342,7 +4342,7 @@
                 <w:sz w:val="17"/>
                 <w:szCs w:val="17"/>
               </w:rPr>
-              <w:t>甲が用意する</w:t>
+              <w:t>乙が用意する</w:t>
             </w:r>
             <w:r>
               <w:rPr>
@@ -4360,14 +4360,14 @@
                 <w:sz w:val="17"/>
                 <w:szCs w:val="17"/>
               </w:rPr>
-              <w:t>等（乙によるアカウント登録は不要）</w:t>
+              <w:t>等（甲によるアカウント登録は不要）</w:t>
             </w:r>
           </w:p>
         </w:tc>
       </w:tr>
       <w:tr>
         <w:trPr>
-          <w:divId w:val="1870140546"/>
+          <w:divId w:val="519316062"/>
         </w:trPr>
         <w:tc>
           <w:tcPr>
@@ -4441,14 +4441,14 @@
                 <w:sz w:val="17"/>
                 <w:szCs w:val="17"/>
               </w:rPr>
-              <w:t>乙が用意する環境への移管可（時期および費用は都度合意）</w:t>
+              <w:t>甲が用意する環境への移管可（時期および費用は都度合意）</w:t>
             </w:r>
           </w:p>
         </w:tc>
       </w:tr>
       <w:tr>
         <w:trPr>
-          <w:divId w:val="1870140546"/>
+          <w:divId w:val="519316062"/>
         </w:trPr>
         <w:tc>
           <w:tcPr>
@@ -4522,14 +4522,14 @@
                 <w:sz w:val="17"/>
                 <w:szCs w:val="17"/>
               </w:rPr>
-              <w:t>甲負担（移管後は乙負担を想定）</w:t>
+              <w:t>乙負担（移管後は甲負担を想定）</w:t>
             </w:r>
           </w:p>
         </w:tc>
       </w:tr>
       <w:tr>
         <w:trPr>
-          <w:divId w:val="1870140546"/>
+          <w:divId w:val="519316062"/>
         </w:trPr>
         <w:tc>
           <w:tcPr>
@@ -4603,7 +4603,7 @@
                 <w:sz w:val="17"/>
                 <w:szCs w:val="17"/>
               </w:rPr>
-              <w:t>別紙記載の範囲を超える改修は別途見積とする。社内ネットワーク限定アクセスの実装には、乙のネットワーク環境に関する協力を要する場合がある。</w:t>
+              <w:t>別紙記載の範囲を超える改修は別途見積とする。社内ネットワーク限定アクセスの実装には、甲のネットワーク環境に関する協力を要する場合がある。</w:t>
             </w:r>
           </w:p>
         </w:tc>
@@ -4614,7 +4614,7 @@
         <w:keepNext/>
         <w:spacing w:after="60"/>
         <w:outlineLvl w:val="3"/>
-        <w:divId w:val="715084088"/>
+        <w:divId w:val="1790516247"/>
         <w:rPr>
           <w:rFonts w:ascii="游明朝" w:eastAsia="游明朝" w:hAnsi="游明朝" w:hint="eastAsia"/>
           <w:b/>
@@ -4654,7 +4654,7 @@
       </w:tblGrid>
       <w:tr>
         <w:trPr>
-          <w:divId w:val="715084088"/>
+          <w:divId w:val="1790516247"/>
         </w:trPr>
         <w:tc>
           <w:tcPr>
@@ -4791,7 +4791,7 @@
       </w:tr>
       <w:tr>
         <w:trPr>
-          <w:divId w:val="715084088"/>
+          <w:divId w:val="1790516247"/>
         </w:trPr>
         <w:tc>
           <w:tcPr>
@@ -4919,7 +4919,7 @@
       </w:tr>
       <w:tr>
         <w:trPr>
-          <w:divId w:val="715084088"/>
+          <w:divId w:val="1790516247"/>
         </w:trPr>
         <w:tc>
           <w:tcPr>
@@ -5065,7 +5065,7 @@
       </w:tr>
       <w:tr>
         <w:trPr>
-          <w:divId w:val="715084088"/>
+          <w:divId w:val="1790516247"/>
         </w:trPr>
         <w:tc>
           <w:tcPr>
@@ -5193,7 +5193,7 @@
       </w:tr>
       <w:tr>
         <w:trPr>
-          <w:divId w:val="715084088"/>
+          <w:divId w:val="1790516247"/>
         </w:trPr>
         <w:tc>
           <w:tcPr>
@@ -5288,7 +5288,7 @@
     </w:tbl>
     <w:p>
       <w:pPr>
-        <w:divId w:val="715084088"/>
+        <w:divId w:val="1790516247"/>
       </w:pPr>
     </w:p>
     <w:sectPr>
@@ -5342,9 +5342,9 @@
 <file path=word/numbering.xml><?xml version="1.0" encoding="utf-8"?>
 <w:numbering xmlns:wpc="http://schemas.microsoft.com/office/word/2010/wordprocessingCanvas" xmlns:cx="http://schemas.microsoft.com/office/drawing/2014/chartex" xmlns:cx1="http://schemas.microsoft.com/office/drawing/2015/9/8/chartex" xmlns:cx2="http://schemas.microsoft.com/office/drawing/2015/10/21/chartex" xmlns:cx3="http://schemas.microsoft.com/office/drawing/2016/5/9/chartex" xmlns:cx4="http://schemas.microsoft.com/office/drawing/2016/5/10/chartex" xmlns:cx5="http://schemas.microsoft.com/office/drawing/2016/5/11/chartex" xmlns:cx6="http://schemas.microsoft.com/office/drawing/2016/5/12/chartex" xmlns:cx7="http://schemas.microsoft.com/office/drawing/2016/5/13/chartex" xmlns:cx8="http://schemas.microsoft.com/office/drawing/2016/5/14/chartex" xmlns:mc="http://schemas.openxmlformats.org/markup-compatibility/2006" xmlns:aink="http://schemas.microsoft.com/office/drawing/2016/ink" xmlns:am3d="http://schemas.microsoft.com/office/drawing/2017/model3d" xmlns:o="urn:schemas-microsoft-com:office:office" xmlns:oel="http://schemas.microsoft.com/office/2019/extlst" xmlns:r="http://schemas.openxmlformats.org/officeDocument/2006/relationships" xmlns:m="http://schemas.openxmlformats.org/officeDocument/2006/math" xmlns:v="urn:schemas-microsoft-com:vml" xmlns:wp14="http://schemas.microsoft.com/office/word/2010/wordprocessingDrawing" xmlns:wp="http://schemas.openxmlformats.org/drawingml/2006/wordprocessingDrawing" xmlns:w10="urn:schemas-microsoft-com:office:word" xmlns:w="http://schemas.openxmlformats.org/wordprocessingml/2006/main" xmlns:w14="http://schemas.microsoft.com/office/word/2010/wordml" xmlns:w15="http://schemas.microsoft.com/office/word/2012/wordml" xmlns:w16cex="http://schemas.microsoft.com/office/word/2018/wordml/cex" xmlns:w16cid="http://schemas.microsoft.com/office/word/2016/wordml/cid" xmlns:w16="http://schemas.microsoft.com/office/word/2018/wordml" xmlns:w16du="http://schemas.microsoft.com/office/word/2023/wordml/word16du" xmlns:w16sdtdh="http://schemas.microsoft.com/office/word/2020/wordml/sdtdatahash" xmlns:w16sdtfl="http://schemas.microsoft.com/office/word/2024/wordml/sdtformatlock" xmlns:w16se="http://schemas.microsoft.com/office/word/2015/wordml/symex" xmlns:wpg="http://schemas.microsoft.com/office/word/2010/wordprocessingGroup" xmlns:wpi="http://schemas.microsoft.com/office/word/2010/wordprocessingInk" xmlns:wne="http://schemas.microsoft.com/office/word/2006/wordml" xmlns:wps="http://schemas.microsoft.com/office/word/2010/wordprocessingShape" mc:Ignorable="w14 w15 w16se w16cid w16 w16cex w16sdtdh w16sdtfl w16du wp14">
   <w:abstractNum w:abstractNumId="0" w15:restartNumberingAfterBreak="0">
-    <w:nsid w:val="12CD7603"/>
+    <w:nsid w:val="08BE0323"/>
     <w:multiLevelType w:val="multilevel"/>
-    <w:tmpl w:val="96F0EAB2"/>
+    <w:tmpl w:val="0F5807B2"/>
     <w:lvl w:ilvl="0">
       <w:start w:val="1"/>
       <w:numFmt w:val="decimal"/>
@@ -5455,9 +5455,9 @@
     </w:lvl>
   </w:abstractNum>
   <w:abstractNum w:abstractNumId="1" w15:restartNumberingAfterBreak="0">
-    <w:nsid w:val="17A82AF6"/>
+    <w:nsid w:val="10E271C8"/>
     <w:multiLevelType w:val="multilevel"/>
-    <w:tmpl w:val="9C6A1278"/>
+    <w:tmpl w:val="CAE07B6E"/>
     <w:lvl w:ilvl="0">
       <w:start w:val="1"/>
       <w:numFmt w:val="decimal"/>
@@ -5568,9 +5568,9 @@
     </w:lvl>
   </w:abstractNum>
   <w:abstractNum w:abstractNumId="2" w15:restartNumberingAfterBreak="0">
-    <w:nsid w:val="1BFE116F"/>
+    <w:nsid w:val="16A60FC1"/>
     <w:multiLevelType w:val="multilevel"/>
-    <w:tmpl w:val="10BA2126"/>
+    <w:tmpl w:val="1C5EC36C"/>
     <w:lvl w:ilvl="0">
       <w:start w:val="1"/>
       <w:numFmt w:val="decimal"/>
@@ -5583,7 +5583,7 @@
         <w:ind w:left="720" w:hanging="360"/>
       </w:pPr>
     </w:lvl>
-    <w:lvl w:ilvl="1" w:tentative="1">
+    <w:lvl w:ilvl="1">
       <w:start w:val="1"/>
       <w:numFmt w:val="decimal"/>
       <w:lvlText w:val="%2."/>
@@ -5681,9 +5681,9 @@
     </w:lvl>
   </w:abstractNum>
   <w:abstractNum w:abstractNumId="3" w15:restartNumberingAfterBreak="0">
-    <w:nsid w:val="1F3E421D"/>
+    <w:nsid w:val="40BF2DEF"/>
     <w:multiLevelType w:val="multilevel"/>
-    <w:tmpl w:val="43CEB4F0"/>
+    <w:tmpl w:val="6B869458"/>
     <w:lvl w:ilvl="0">
       <w:start w:val="1"/>
       <w:numFmt w:val="decimal"/>
@@ -5794,9 +5794,9 @@
     </w:lvl>
   </w:abstractNum>
   <w:abstractNum w:abstractNumId="4" w15:restartNumberingAfterBreak="0">
-    <w:nsid w:val="208E0F74"/>
+    <w:nsid w:val="442B6334"/>
     <w:multiLevelType w:val="multilevel"/>
-    <w:tmpl w:val="3014BEA2"/>
+    <w:tmpl w:val="1C1E18F4"/>
     <w:lvl w:ilvl="0">
       <w:start w:val="1"/>
       <w:numFmt w:val="decimal"/>
@@ -5907,9 +5907,9 @@
     </w:lvl>
   </w:abstractNum>
   <w:abstractNum w:abstractNumId="5" w15:restartNumberingAfterBreak="0">
-    <w:nsid w:val="28A3273C"/>
+    <w:nsid w:val="48873275"/>
     <w:multiLevelType w:val="multilevel"/>
-    <w:tmpl w:val="DD92EC6A"/>
+    <w:tmpl w:val="DEF63F46"/>
     <w:lvl w:ilvl="0">
       <w:start w:val="1"/>
       <w:numFmt w:val="decimal"/>
@@ -5922,7 +5922,7 @@
         <w:ind w:left="720" w:hanging="360"/>
       </w:pPr>
     </w:lvl>
-    <w:lvl w:ilvl="1">
+    <w:lvl w:ilvl="1" w:tentative="1">
       <w:start w:val="1"/>
       <w:numFmt w:val="decimal"/>
       <w:lvlText w:val="%2."/>
@@ -6020,9 +6020,9 @@
     </w:lvl>
   </w:abstractNum>
   <w:abstractNum w:abstractNumId="6" w15:restartNumberingAfterBreak="0">
-    <w:nsid w:val="357E72F6"/>
+    <w:nsid w:val="497843DB"/>
     <w:multiLevelType w:val="multilevel"/>
-    <w:tmpl w:val="4C5CE64E"/>
+    <w:tmpl w:val="B5F6111E"/>
     <w:lvl w:ilvl="0">
       <w:start w:val="1"/>
       <w:numFmt w:val="decimal"/>
@@ -6133,9 +6133,9 @@
     </w:lvl>
   </w:abstractNum>
   <w:abstractNum w:abstractNumId="7" w15:restartNumberingAfterBreak="0">
-    <w:nsid w:val="38066D67"/>
+    <w:nsid w:val="49C84176"/>
     <w:multiLevelType w:val="multilevel"/>
-    <w:tmpl w:val="9698D402"/>
+    <w:tmpl w:val="02A842C2"/>
     <w:lvl w:ilvl="0">
       <w:start w:val="1"/>
       <w:numFmt w:val="decimal"/>
@@ -6246,9 +6246,9 @@
     </w:lvl>
   </w:abstractNum>
   <w:abstractNum w:abstractNumId="8" w15:restartNumberingAfterBreak="0">
-    <w:nsid w:val="5C83516C"/>
+    <w:nsid w:val="4BA368DC"/>
     <w:multiLevelType w:val="multilevel"/>
-    <w:tmpl w:val="D702071C"/>
+    <w:tmpl w:val="3ED4CBD2"/>
     <w:lvl w:ilvl="0">
       <w:start w:val="1"/>
       <w:numFmt w:val="decimal"/>
@@ -6359,9 +6359,9 @@
     </w:lvl>
   </w:abstractNum>
   <w:abstractNum w:abstractNumId="9" w15:restartNumberingAfterBreak="0">
-    <w:nsid w:val="61B93BA1"/>
+    <w:nsid w:val="58207B6A"/>
     <w:multiLevelType w:val="multilevel"/>
-    <w:tmpl w:val="AD344DC4"/>
+    <w:tmpl w:val="ADA2BAC2"/>
     <w:lvl w:ilvl="0">
       <w:start w:val="1"/>
       <w:numFmt w:val="decimal"/>
@@ -6374,7 +6374,7 @@
         <w:ind w:left="720" w:hanging="360"/>
       </w:pPr>
     </w:lvl>
-    <w:lvl w:ilvl="1" w:tentative="1">
+    <w:lvl w:ilvl="1">
       <w:start w:val="1"/>
       <w:numFmt w:val="decimal"/>
       <w:lvlText w:val="%2."/>
@@ -6472,9 +6472,9 @@
     </w:lvl>
   </w:abstractNum>
   <w:abstractNum w:abstractNumId="10" w15:restartNumberingAfterBreak="0">
-    <w:nsid w:val="68BD67BF"/>
+    <w:nsid w:val="639C136B"/>
     <w:multiLevelType w:val="multilevel"/>
-    <w:tmpl w:val="B846D876"/>
+    <w:tmpl w:val="4B5424D8"/>
     <w:lvl w:ilvl="0">
       <w:start w:val="1"/>
       <w:numFmt w:val="decimal"/>
@@ -6487,7 +6487,7 @@
         <w:ind w:left="720" w:hanging="360"/>
       </w:pPr>
     </w:lvl>
-    <w:lvl w:ilvl="1">
+    <w:lvl w:ilvl="1" w:tentative="1">
       <w:start w:val="1"/>
       <w:numFmt w:val="decimal"/>
       <w:lvlText w:val="%2."/>
@@ -6585,9 +6585,9 @@
     </w:lvl>
   </w:abstractNum>
   <w:abstractNum w:abstractNumId="11" w15:restartNumberingAfterBreak="0">
-    <w:nsid w:val="76057E6F"/>
+    <w:nsid w:val="70D60EA3"/>
     <w:multiLevelType w:val="multilevel"/>
-    <w:tmpl w:val="5AE45D52"/>
+    <w:tmpl w:val="46746182"/>
     <w:lvl w:ilvl="0">
       <w:start w:val="1"/>
       <w:numFmt w:val="decimal"/>
@@ -6698,9 +6698,9 @@
     </w:lvl>
   </w:abstractNum>
   <w:abstractNum w:abstractNumId="12" w15:restartNumberingAfterBreak="0">
-    <w:nsid w:val="7D224D97"/>
+    <w:nsid w:val="7DB97373"/>
     <w:multiLevelType w:val="multilevel"/>
-    <w:tmpl w:val="BFA258C2"/>
+    <w:tmpl w:val="95F20C1E"/>
     <w:lvl w:ilvl="0">
       <w:start w:val="1"/>
       <w:numFmt w:val="decimal"/>
@@ -6810,44 +6810,44 @@
       </w:pPr>
     </w:lvl>
   </w:abstractNum>
-  <w:num w:numId="1" w16cid:durableId="705178573">
+  <w:num w:numId="1" w16cid:durableId="769741781">
+    <w:abstractNumId w:val="3"/>
+  </w:num>
+  <w:num w:numId="2" w16cid:durableId="2132938248">
+    <w:abstractNumId w:val="6"/>
+  </w:num>
+  <w:num w:numId="3" w16cid:durableId="970598766">
     <w:abstractNumId w:val="0"/>
   </w:num>
-  <w:num w:numId="2" w16cid:durableId="373694471">
+  <w:num w:numId="4" w16cid:durableId="1220899352">
+    <w:abstractNumId w:val="1"/>
+  </w:num>
+  <w:num w:numId="5" w16cid:durableId="2061636492">
+    <w:abstractNumId w:val="10"/>
+  </w:num>
+  <w:num w:numId="6" w16cid:durableId="1436485643">
     <w:abstractNumId w:val="2"/>
   </w:num>
-  <w:num w:numId="3" w16cid:durableId="1937788327">
+  <w:num w:numId="7" w16cid:durableId="1081100264">
+    <w:abstractNumId w:val="7"/>
+  </w:num>
+  <w:num w:numId="8" w16cid:durableId="267087157">
     <w:abstractNumId w:val="9"/>
   </w:num>
-  <w:num w:numId="4" w16cid:durableId="1690720474">
-    <w:abstractNumId w:val="7"/>
+  <w:num w:numId="9" w16cid:durableId="1814323748">
+    <w:abstractNumId w:val="8"/>
   </w:num>
-  <w:num w:numId="5" w16cid:durableId="1235706033">
+  <w:num w:numId="10" w16cid:durableId="1959986155">
+    <w:abstractNumId w:val="5"/>
+  </w:num>
+  <w:num w:numId="11" w16cid:durableId="297690625">
+    <w:abstractNumId w:val="12"/>
+  </w:num>
+  <w:num w:numId="12" w16cid:durableId="202980997">
     <w:abstractNumId w:val="11"/>
   </w:num>
-  <w:num w:numId="6" w16cid:durableId="242106337">
-    <w:abstractNumId w:val="5"/>
-  </w:num>
-  <w:num w:numId="7" w16cid:durableId="63189904">
-    <w:abstractNumId w:val="8"/>
-  </w:num>
-  <w:num w:numId="8" w16cid:durableId="1436168365">
-    <w:abstractNumId w:val="10"/>
-  </w:num>
-  <w:num w:numId="9" w16cid:durableId="94786252">
-    <w:abstractNumId w:val="3"/>
-  </w:num>
-  <w:num w:numId="10" w16cid:durableId="1929389512">
+  <w:num w:numId="13" w16cid:durableId="1667438965">
     <w:abstractNumId w:val="4"/>
-  </w:num>
-  <w:num w:numId="11" w16cid:durableId="1839081313">
-    <w:abstractNumId w:val="6"/>
-  </w:num>
-  <w:num w:numId="12" w16cid:durableId="1401906273">
-    <w:abstractNumId w:val="12"/>
-  </w:num>
-  <w:num w:numId="13" w16cid:durableId="2037194324">
-    <w:abstractNumId w:val="1"/>
   </w:num>
 </w:numbering>
 </file>
@@ -7536,7 +7536,7 @@
     <w:link w:val="a5"/>
     <w:uiPriority w:val="99"/>
     <w:unhideWhenUsed/>
-    <w:rsid w:val="00E252ED"/>
+    <w:rsid w:val="002A1E2F"/>
     <w:pPr>
       <w:tabs>
         <w:tab w:val="center" w:pos="4252"/>
@@ -7550,7 +7550,7 @@
     <w:basedOn w:val="a0"/>
     <w:link w:val="a4"/>
     <w:uiPriority w:val="99"/>
-    <w:rsid w:val="00E252ED"/>
+    <w:rsid w:val="002A1E2F"/>
     <w:rPr>
       <w:rFonts w:ascii="ＭＳ Ｐゴシック" w:eastAsia="ＭＳ Ｐゴシック" w:hAnsi="ＭＳ Ｐゴシック" w:cs="ＭＳ Ｐゴシック"/>
       <w:sz w:val="24"/>
@@ -7563,7 +7563,7 @@
     <w:link w:val="a7"/>
     <w:uiPriority w:val="99"/>
     <w:unhideWhenUsed/>
-    <w:rsid w:val="00E252ED"/>
+    <w:rsid w:val="002A1E2F"/>
     <w:pPr>
       <w:tabs>
         <w:tab w:val="center" w:pos="4252"/>
@@ -7577,7 +7577,7 @@
     <w:basedOn w:val="a0"/>
     <w:link w:val="a6"/>
     <w:uiPriority w:val="99"/>
-    <w:rsid w:val="00E252ED"/>
+    <w:rsid w:val="002A1E2F"/>
     <w:rPr>
       <w:rFonts w:ascii="ＭＳ Ｐゴシック" w:eastAsia="ＭＳ Ｐゴシック" w:hAnsi="ＭＳ Ｐゴシック" w:cs="ＭＳ Ｐゴシック"/>
       <w:sz w:val="24"/>

</xml_diff>

<commit_message>
Widen contract signature boxes and align signer name with seal.
Keep Kou/Otsu labels; give more vertical room for stamping.

Co-authored-by: Cursor <cursoragent@cursor.com>
</commit_message>
<xml_diff>
--- a/docs/利用契約書_草案.docx
+++ b/docs/利用契約書_草案.docx
@@ -5,7 +5,7 @@
     <w:p>
       <w:pPr>
         <w:shd w:val="clear" w:color="auto" w:fill="FFFFFF"/>
-        <w:divId w:val="180512435"/>
+        <w:divId w:val="1414201465"/>
         <w:rPr>
           <w:rFonts w:ascii="游ゴシック" w:eastAsia="游ゴシック" w:hAnsi="游ゴシック"/>
           <w:color w:val="111111"/>
@@ -89,7 +89,7 @@
     <w:p>
       <w:pPr>
         <w:shd w:val="clear" w:color="auto" w:fill="F6F6F6"/>
-        <w:divId w:val="1979603129"/>
+        <w:divId w:val="394089058"/>
         <w:rPr>
           <w:rFonts w:ascii="游ゴシック" w:eastAsia="游ゴシック" w:hAnsi="游ゴシック" w:hint="eastAsia"/>
           <w:color w:val="444444"/>
@@ -153,7 +153,7 @@
     <w:p>
       <w:pPr>
         <w:pStyle w:val="label1"/>
-        <w:divId w:val="1096634552"/>
+        <w:divId w:val="308946691"/>
         <w:rPr>
           <w:rFonts w:ascii="游明朝" w:eastAsia="游明朝" w:hAnsi="游明朝" w:hint="eastAsia"/>
           <w:color w:val="111111"/>
@@ -175,7 +175,7 @@
       <w:pPr>
         <w:spacing w:before="30" w:after="30"/>
         <w:jc w:val="both"/>
-        <w:divId w:val="1096634552"/>
+        <w:divId w:val="308946691"/>
         <w:rPr>
           <w:rFonts w:ascii="游明朝" w:eastAsia="游明朝" w:hAnsi="游明朝" w:hint="eastAsia"/>
           <w:color w:val="111111"/>
@@ -196,7 +196,7 @@
     <w:p>
       <w:pPr>
         <w:pStyle w:val="label1"/>
-        <w:divId w:val="1096634552"/>
+        <w:divId w:val="308946691"/>
         <w:rPr>
           <w:rFonts w:ascii="游明朝" w:eastAsia="游明朝" w:hAnsi="游明朝" w:hint="eastAsia"/>
           <w:color w:val="111111"/>
@@ -218,7 +218,7 @@
       <w:pPr>
         <w:spacing w:before="30" w:after="30"/>
         <w:jc w:val="both"/>
-        <w:divId w:val="1096634552"/>
+        <w:divId w:val="308946691"/>
         <w:rPr>
           <w:rFonts w:ascii="游明朝" w:eastAsia="游明朝" w:hAnsi="游明朝" w:hint="eastAsia"/>
           <w:color w:val="111111"/>
@@ -2627,7 +2627,7 @@
     </w:p>
     <w:p>
       <w:pPr>
-        <w:divId w:val="1406759062"/>
+        <w:divId w:val="31811450"/>
         <w:rPr>
           <w:rFonts w:ascii="游明朝" w:eastAsia="游明朝" w:hAnsi="游明朝" w:hint="eastAsia"/>
           <w:b/>
@@ -2653,7 +2653,7 @@
       <w:pPr>
         <w:spacing w:before="60" w:after="60"/>
         <w:jc w:val="both"/>
-        <w:divId w:val="846138135"/>
+        <w:divId w:val="1125655937"/>
         <w:rPr>
           <w:rFonts w:ascii="游明朝" w:eastAsia="游明朝" w:hAnsi="游明朝" w:hint="eastAsia"/>
           <w:color w:val="111111"/>
@@ -2675,7 +2675,7 @@
       <w:pPr>
         <w:spacing w:before="60" w:after="60"/>
         <w:jc w:val="both"/>
-        <w:divId w:val="846138135"/>
+        <w:divId w:val="1125655937"/>
         <w:rPr>
           <w:rFonts w:ascii="游明朝" w:eastAsia="游明朝" w:hAnsi="游明朝" w:hint="eastAsia"/>
           <w:color w:val="111111"/>
@@ -2691,126 +2691,124 @@
           <w:szCs w:val="19"/>
         </w:rPr>
         <w:t>日付：　　　年　　　月　　　日</w:t>
+      </w:r>
+    </w:p>
+    <w:p>
+      <w:pPr>
+        <w:jc w:val="both"/>
+        <w:divId w:val="1218321728"/>
+        <w:rPr>
+          <w:rFonts w:ascii="游明朝" w:eastAsia="游明朝" w:hAnsi="游明朝" w:hint="eastAsia"/>
+          <w:color w:val="111111"/>
+          <w:sz w:val="19"/>
+          <w:szCs w:val="19"/>
+        </w:rPr>
+      </w:pPr>
+      <w:r>
+        <w:rPr>
+          <w:rFonts w:ascii="游明朝" w:eastAsia="游明朝" w:hAnsi="游明朝" w:hint="eastAsia"/>
+          <w:color w:val="111111"/>
+          <w:sz w:val="19"/>
+          <w:szCs w:val="19"/>
+        </w:rPr>
+        <w:t>記名押印者氏名：＿＿＿＿＿＿＿＿＿＿＿＿</w:t>
+      </w:r>
+    </w:p>
+    <w:p>
+      <w:pPr>
+        <w:jc w:val="right"/>
+        <w:divId w:val="1218321728"/>
+        <w:rPr>
+          <w:rFonts w:ascii="游明朝" w:eastAsia="游明朝" w:hAnsi="游明朝" w:hint="eastAsia"/>
+          <w:color w:val="111111"/>
+          <w:spacing w:val="360"/>
+          <w:sz w:val="19"/>
+          <w:szCs w:val="19"/>
+        </w:rPr>
+      </w:pPr>
+      <w:r>
+        <w:rPr>
+          <w:rFonts w:ascii="游明朝" w:eastAsia="游明朝" w:hAnsi="游明朝" w:hint="eastAsia"/>
+          <w:color w:val="111111"/>
+          <w:spacing w:val="360"/>
+          <w:sz w:val="19"/>
+          <w:szCs w:val="19"/>
+        </w:rPr>
+        <w:t>印</w:t>
+      </w:r>
+    </w:p>
+    <w:p>
+      <w:pPr>
+        <w:divId w:val="1657686823"/>
+        <w:rPr>
+          <w:rFonts w:ascii="游明朝" w:eastAsia="游明朝" w:hAnsi="游明朝" w:hint="eastAsia"/>
+          <w:b/>
+          <w:bCs/>
+          <w:color w:val="111111"/>
+          <w:sz w:val="19"/>
+          <w:szCs w:val="19"/>
+        </w:rPr>
+      </w:pPr>
+      <w:r>
+        <w:rPr>
+          <w:rFonts w:ascii="游明朝" w:eastAsia="游明朝" w:hAnsi="游明朝" w:hint="eastAsia"/>
+          <w:b/>
+          <w:bCs/>
+          <w:color w:val="111111"/>
+          <w:sz w:val="19"/>
+          <w:szCs w:val="19"/>
+        </w:rPr>
+        <w:t>乙（提供者）</w:t>
       </w:r>
     </w:p>
     <w:p>
       <w:pPr>
         <w:spacing w:before="60" w:after="60"/>
         <w:jc w:val="both"/>
-        <w:divId w:val="846138135"/>
-        <w:rPr>
-          <w:rFonts w:ascii="游明朝" w:eastAsia="游明朝" w:hAnsi="游明朝" w:hint="eastAsia"/>
-          <w:color w:val="111111"/>
-          <w:sz w:val="19"/>
-          <w:szCs w:val="19"/>
-        </w:rPr>
-      </w:pPr>
-      <w:r>
-        <w:rPr>
-          <w:rFonts w:ascii="游明朝" w:eastAsia="游明朝" w:hAnsi="游明朝" w:hint="eastAsia"/>
-          <w:color w:val="111111"/>
-          <w:sz w:val="19"/>
-          <w:szCs w:val="19"/>
-        </w:rPr>
-        <w:t>記名押印者氏名：＿＿＿＿＿＿＿＿＿＿＿＿</w:t>
-      </w:r>
-    </w:p>
-    <w:p>
-      <w:pPr>
-        <w:jc w:val="right"/>
-        <w:divId w:val="1139229492"/>
-        <w:rPr>
-          <w:rFonts w:ascii="游明朝" w:eastAsia="游明朝" w:hAnsi="游明朝" w:hint="eastAsia"/>
-          <w:color w:val="111111"/>
-          <w:spacing w:val="360"/>
-          <w:sz w:val="19"/>
-          <w:szCs w:val="19"/>
-        </w:rPr>
-      </w:pPr>
-      <w:r>
-        <w:rPr>
-          <w:rFonts w:ascii="游明朝" w:eastAsia="游明朝" w:hAnsi="游明朝" w:hint="eastAsia"/>
-          <w:color w:val="111111"/>
-          <w:spacing w:val="360"/>
-          <w:sz w:val="19"/>
-          <w:szCs w:val="19"/>
-        </w:rPr>
-        <w:t>印</w:t>
-      </w:r>
-    </w:p>
-    <w:p>
-      <w:pPr>
-        <w:divId w:val="2071417615"/>
-        <w:rPr>
-          <w:rFonts w:ascii="游明朝" w:eastAsia="游明朝" w:hAnsi="游明朝" w:hint="eastAsia"/>
-          <w:b/>
-          <w:bCs/>
-          <w:color w:val="111111"/>
-          <w:sz w:val="19"/>
-          <w:szCs w:val="19"/>
-        </w:rPr>
-      </w:pPr>
-      <w:r>
-        <w:rPr>
-          <w:rFonts w:ascii="游明朝" w:eastAsia="游明朝" w:hAnsi="游明朝" w:hint="eastAsia"/>
-          <w:b/>
-          <w:bCs/>
-          <w:color w:val="111111"/>
-          <w:sz w:val="19"/>
-          <w:szCs w:val="19"/>
-        </w:rPr>
-        <w:t>乙（提供者）</w:t>
+        <w:divId w:val="1084690645"/>
+        <w:rPr>
+          <w:rFonts w:ascii="游明朝" w:eastAsia="游明朝" w:hAnsi="游明朝" w:hint="eastAsia"/>
+          <w:color w:val="111111"/>
+          <w:sz w:val="19"/>
+          <w:szCs w:val="19"/>
+        </w:rPr>
+      </w:pPr>
+      <w:r>
+        <w:rPr>
+          <w:rFonts w:ascii="游明朝" w:eastAsia="游明朝" w:hAnsi="游明朝" w:hint="eastAsia"/>
+          <w:color w:val="111111"/>
+          <w:sz w:val="19"/>
+          <w:szCs w:val="19"/>
+        </w:rPr>
+        <w:t>名称：〔　　　　　　　　　　〕</w:t>
       </w:r>
     </w:p>
     <w:p>
       <w:pPr>
         <w:spacing w:before="60" w:after="60"/>
         <w:jc w:val="both"/>
-        <w:divId w:val="1276475465"/>
-        <w:rPr>
-          <w:rFonts w:ascii="游明朝" w:eastAsia="游明朝" w:hAnsi="游明朝" w:hint="eastAsia"/>
-          <w:color w:val="111111"/>
-          <w:sz w:val="19"/>
-          <w:szCs w:val="19"/>
-        </w:rPr>
-      </w:pPr>
-      <w:r>
-        <w:rPr>
-          <w:rFonts w:ascii="游明朝" w:eastAsia="游明朝" w:hAnsi="游明朝" w:hint="eastAsia"/>
-          <w:color w:val="111111"/>
-          <w:sz w:val="19"/>
-          <w:szCs w:val="19"/>
-        </w:rPr>
-        <w:t>名称：〔　　　　　　　　　　〕</w:t>
-      </w:r>
-    </w:p>
-    <w:p>
-      <w:pPr>
-        <w:spacing w:before="60" w:after="60"/>
+        <w:divId w:val="1084690645"/>
+        <w:rPr>
+          <w:rFonts w:ascii="游明朝" w:eastAsia="游明朝" w:hAnsi="游明朝" w:hint="eastAsia"/>
+          <w:color w:val="111111"/>
+          <w:sz w:val="19"/>
+          <w:szCs w:val="19"/>
+        </w:rPr>
+      </w:pPr>
+      <w:r>
+        <w:rPr>
+          <w:rFonts w:ascii="游明朝" w:eastAsia="游明朝" w:hAnsi="游明朝" w:hint="eastAsia"/>
+          <w:color w:val="111111"/>
+          <w:sz w:val="19"/>
+          <w:szCs w:val="19"/>
+        </w:rPr>
+        <w:t>日付：　　　年　　　月　　　日</w:t>
+      </w:r>
+    </w:p>
+    <w:p>
+      <w:pPr>
         <w:jc w:val="both"/>
-        <w:divId w:val="1276475465"/>
-        <w:rPr>
-          <w:rFonts w:ascii="游明朝" w:eastAsia="游明朝" w:hAnsi="游明朝" w:hint="eastAsia"/>
-          <w:color w:val="111111"/>
-          <w:sz w:val="19"/>
-          <w:szCs w:val="19"/>
-        </w:rPr>
-      </w:pPr>
-      <w:r>
-        <w:rPr>
-          <w:rFonts w:ascii="游明朝" w:eastAsia="游明朝" w:hAnsi="游明朝" w:hint="eastAsia"/>
-          <w:color w:val="111111"/>
-          <w:sz w:val="19"/>
-          <w:szCs w:val="19"/>
-        </w:rPr>
-        <w:t>日付：　　　年　　　月　　　日</w:t>
-      </w:r>
-    </w:p>
-    <w:p>
-      <w:pPr>
-        <w:spacing w:before="60" w:after="60"/>
-        <w:jc w:val="both"/>
-        <w:divId w:val="1276475465"/>
+        <w:divId w:val="1160847544"/>
         <w:rPr>
           <w:rFonts w:ascii="游明朝" w:eastAsia="游明朝" w:hAnsi="游明朝" w:hint="eastAsia"/>
           <w:color w:val="111111"/>
@@ -2831,7 +2829,7 @@
     <w:p>
       <w:pPr>
         <w:jc w:val="right"/>
-        <w:divId w:val="218248451"/>
+        <w:divId w:val="1160847544"/>
         <w:rPr>
           <w:rFonts w:ascii="游明朝" w:eastAsia="游明朝" w:hAnsi="游明朝" w:hint="eastAsia"/>
           <w:color w:val="111111"/>
@@ -2854,7 +2852,7 @@
     <w:p>
       <w:pPr>
         <w:pStyle w:val="2"/>
-        <w:divId w:val="519316062"/>
+        <w:divId w:val="1994215276"/>
         <w:rPr>
           <w:rFonts w:ascii="游明朝" w:eastAsia="游明朝" w:hAnsi="游明朝" w:hint="eastAsia"/>
           <w:color w:val="111111"/>
@@ -2871,7 +2869,7 @@
     <w:p>
       <w:pPr>
         <w:pStyle w:val="Web"/>
-        <w:divId w:val="519316062"/>
+        <w:divId w:val="1994215276"/>
         <w:rPr>
           <w:rFonts w:ascii="游明朝" w:eastAsia="游明朝" w:hAnsi="游明朝" w:hint="eastAsia"/>
           <w:color w:val="111111"/>
@@ -2906,7 +2904,7 @@
       </w:tblGrid>
       <w:tr>
         <w:trPr>
-          <w:divId w:val="519316062"/>
+          <w:divId w:val="1994215276"/>
         </w:trPr>
         <w:tc>
           <w:tcPr>
@@ -2999,7 +2997,7 @@
       </w:tr>
       <w:tr>
         <w:trPr>
-          <w:divId w:val="519316062"/>
+          <w:divId w:val="1994215276"/>
         </w:trPr>
         <w:tc>
           <w:tcPr>
@@ -3080,7 +3078,7 @@
       </w:tr>
       <w:tr>
         <w:trPr>
-          <w:divId w:val="519316062"/>
+          <w:divId w:val="1994215276"/>
         </w:trPr>
         <w:tc>
           <w:tcPr>
@@ -3170,7 +3168,7 @@
       </w:tr>
       <w:tr>
         <w:trPr>
-          <w:divId w:val="519316062"/>
+          <w:divId w:val="1994215276"/>
         </w:trPr>
         <w:tc>
           <w:tcPr>
@@ -3305,7 +3303,7 @@
       </w:tr>
       <w:tr>
         <w:trPr>
-          <w:divId w:val="519316062"/>
+          <w:divId w:val="1994215276"/>
         </w:trPr>
         <w:tc>
           <w:tcPr>
@@ -3386,7 +3384,7 @@
       </w:tr>
       <w:tr>
         <w:trPr>
-          <w:divId w:val="519316062"/>
+          <w:divId w:val="1994215276"/>
         </w:trPr>
         <w:tc>
           <w:tcPr>
@@ -3476,7 +3474,7 @@
       </w:tr>
       <w:tr>
         <w:trPr>
-          <w:divId w:val="519316062"/>
+          <w:divId w:val="1994215276"/>
         </w:trPr>
         <w:tc>
           <w:tcPr>
@@ -3566,7 +3564,7 @@
       </w:tr>
       <w:tr>
         <w:trPr>
-          <w:divId w:val="519316062"/>
+          <w:divId w:val="1994215276"/>
         </w:trPr>
         <w:tc>
           <w:tcPr>
@@ -3656,7 +3654,7 @@
       </w:tr>
       <w:tr>
         <w:trPr>
-          <w:divId w:val="519316062"/>
+          <w:divId w:val="1994215276"/>
         </w:trPr>
         <w:tc>
           <w:tcPr>
@@ -3746,7 +3744,7 @@
       </w:tr>
       <w:tr>
         <w:trPr>
-          <w:divId w:val="519316062"/>
+          <w:divId w:val="1994215276"/>
         </w:trPr>
         <w:tc>
           <w:tcPr>
@@ -3827,7 +3825,7 @@
       </w:tr>
       <w:tr>
         <w:trPr>
-          <w:divId w:val="519316062"/>
+          <w:divId w:val="1994215276"/>
         </w:trPr>
         <w:tc>
           <w:tcPr>
@@ -3980,7 +3978,7 @@
       </w:tr>
       <w:tr>
         <w:trPr>
-          <w:divId w:val="519316062"/>
+          <w:divId w:val="1994215276"/>
         </w:trPr>
         <w:tc>
           <w:tcPr>
@@ -4097,7 +4095,7 @@
       </w:tr>
       <w:tr>
         <w:trPr>
-          <w:divId w:val="519316062"/>
+          <w:divId w:val="1994215276"/>
         </w:trPr>
         <w:tc>
           <w:tcPr>
@@ -4178,7 +4176,7 @@
       </w:tr>
       <w:tr>
         <w:trPr>
-          <w:divId w:val="519316062"/>
+          <w:divId w:val="1994215276"/>
         </w:trPr>
         <w:tc>
           <w:tcPr>
@@ -4268,7 +4266,7 @@
       </w:tr>
       <w:tr>
         <w:trPr>
-          <w:divId w:val="519316062"/>
+          <w:divId w:val="1994215276"/>
         </w:trPr>
         <w:tc>
           <w:tcPr>
@@ -4367,7 +4365,7 @@
       </w:tr>
       <w:tr>
         <w:trPr>
-          <w:divId w:val="519316062"/>
+          <w:divId w:val="1994215276"/>
         </w:trPr>
         <w:tc>
           <w:tcPr>
@@ -4448,7 +4446,7 @@
       </w:tr>
       <w:tr>
         <w:trPr>
-          <w:divId w:val="519316062"/>
+          <w:divId w:val="1994215276"/>
         </w:trPr>
         <w:tc>
           <w:tcPr>
@@ -4529,7 +4527,7 @@
       </w:tr>
       <w:tr>
         <w:trPr>
-          <w:divId w:val="519316062"/>
+          <w:divId w:val="1994215276"/>
         </w:trPr>
         <w:tc>
           <w:tcPr>
@@ -4614,7 +4612,7 @@
         <w:keepNext/>
         <w:spacing w:after="60"/>
         <w:outlineLvl w:val="3"/>
-        <w:divId w:val="1790516247"/>
+        <w:divId w:val="2019501402"/>
         <w:rPr>
           <w:rFonts w:ascii="游明朝" w:eastAsia="游明朝" w:hAnsi="游明朝" w:hint="eastAsia"/>
           <w:b/>
@@ -4654,7 +4652,7 @@
       </w:tblGrid>
       <w:tr>
         <w:trPr>
-          <w:divId w:val="1790516247"/>
+          <w:divId w:val="2019501402"/>
         </w:trPr>
         <w:tc>
           <w:tcPr>
@@ -4791,7 +4789,7 @@
       </w:tr>
       <w:tr>
         <w:trPr>
-          <w:divId w:val="1790516247"/>
+          <w:divId w:val="2019501402"/>
         </w:trPr>
         <w:tc>
           <w:tcPr>
@@ -4919,7 +4917,7 @@
       </w:tr>
       <w:tr>
         <w:trPr>
-          <w:divId w:val="1790516247"/>
+          <w:divId w:val="2019501402"/>
         </w:trPr>
         <w:tc>
           <w:tcPr>
@@ -5065,7 +5063,7 @@
       </w:tr>
       <w:tr>
         <w:trPr>
-          <w:divId w:val="1790516247"/>
+          <w:divId w:val="2019501402"/>
         </w:trPr>
         <w:tc>
           <w:tcPr>
@@ -5193,7 +5191,7 @@
       </w:tr>
       <w:tr>
         <w:trPr>
-          <w:divId w:val="1790516247"/>
+          <w:divId w:val="2019501402"/>
         </w:trPr>
         <w:tc>
           <w:tcPr>
@@ -5288,7 +5286,7 @@
     </w:tbl>
     <w:p>
       <w:pPr>
-        <w:divId w:val="1790516247"/>
+        <w:divId w:val="2019501402"/>
       </w:pPr>
     </w:p>
     <w:sectPr>
@@ -5342,9 +5340,9 @@
 <file path=word/numbering.xml><?xml version="1.0" encoding="utf-8"?>
 <w:numbering xmlns:wpc="http://schemas.microsoft.com/office/word/2010/wordprocessingCanvas" xmlns:cx="http://schemas.microsoft.com/office/drawing/2014/chartex" xmlns:cx1="http://schemas.microsoft.com/office/drawing/2015/9/8/chartex" xmlns:cx2="http://schemas.microsoft.com/office/drawing/2015/10/21/chartex" xmlns:cx3="http://schemas.microsoft.com/office/drawing/2016/5/9/chartex" xmlns:cx4="http://schemas.microsoft.com/office/drawing/2016/5/10/chartex" xmlns:cx5="http://schemas.microsoft.com/office/drawing/2016/5/11/chartex" xmlns:cx6="http://schemas.microsoft.com/office/drawing/2016/5/12/chartex" xmlns:cx7="http://schemas.microsoft.com/office/drawing/2016/5/13/chartex" xmlns:cx8="http://schemas.microsoft.com/office/drawing/2016/5/14/chartex" xmlns:mc="http://schemas.openxmlformats.org/markup-compatibility/2006" xmlns:aink="http://schemas.microsoft.com/office/drawing/2016/ink" xmlns:am3d="http://schemas.microsoft.com/office/drawing/2017/model3d" xmlns:o="urn:schemas-microsoft-com:office:office" xmlns:oel="http://schemas.microsoft.com/office/2019/extlst" xmlns:r="http://schemas.openxmlformats.org/officeDocument/2006/relationships" xmlns:m="http://schemas.openxmlformats.org/officeDocument/2006/math" xmlns:v="urn:schemas-microsoft-com:vml" xmlns:wp14="http://schemas.microsoft.com/office/word/2010/wordprocessingDrawing" xmlns:wp="http://schemas.openxmlformats.org/drawingml/2006/wordprocessingDrawing" xmlns:w10="urn:schemas-microsoft-com:office:word" xmlns:w="http://schemas.openxmlformats.org/wordprocessingml/2006/main" xmlns:w14="http://schemas.microsoft.com/office/word/2010/wordml" xmlns:w15="http://schemas.microsoft.com/office/word/2012/wordml" xmlns:w16cex="http://schemas.microsoft.com/office/word/2018/wordml/cex" xmlns:w16cid="http://schemas.microsoft.com/office/word/2016/wordml/cid" xmlns:w16="http://schemas.microsoft.com/office/word/2018/wordml" xmlns:w16du="http://schemas.microsoft.com/office/word/2023/wordml/word16du" xmlns:w16sdtdh="http://schemas.microsoft.com/office/word/2020/wordml/sdtdatahash" xmlns:w16sdtfl="http://schemas.microsoft.com/office/word/2024/wordml/sdtformatlock" xmlns:w16se="http://schemas.microsoft.com/office/word/2015/wordml/symex" xmlns:wpg="http://schemas.microsoft.com/office/word/2010/wordprocessingGroup" xmlns:wpi="http://schemas.microsoft.com/office/word/2010/wordprocessingInk" xmlns:wne="http://schemas.microsoft.com/office/word/2006/wordml" xmlns:wps="http://schemas.microsoft.com/office/word/2010/wordprocessingShape" mc:Ignorable="w14 w15 w16se w16cid w16 w16cex w16sdtdh w16sdtfl w16du wp14">
   <w:abstractNum w:abstractNumId="0" w15:restartNumberingAfterBreak="0">
-    <w:nsid w:val="08BE0323"/>
+    <w:nsid w:val="096A457F"/>
     <w:multiLevelType w:val="multilevel"/>
-    <w:tmpl w:val="0F5807B2"/>
+    <w:tmpl w:val="A41C31A2"/>
     <w:lvl w:ilvl="0">
       <w:start w:val="1"/>
       <w:numFmt w:val="decimal"/>
@@ -5455,9 +5453,9 @@
     </w:lvl>
   </w:abstractNum>
   <w:abstractNum w:abstractNumId="1" w15:restartNumberingAfterBreak="0">
-    <w:nsid w:val="10E271C8"/>
+    <w:nsid w:val="1357355A"/>
     <w:multiLevelType w:val="multilevel"/>
-    <w:tmpl w:val="CAE07B6E"/>
+    <w:tmpl w:val="E18E87FC"/>
     <w:lvl w:ilvl="0">
       <w:start w:val="1"/>
       <w:numFmt w:val="decimal"/>
@@ -5470,7 +5468,7 @@
         <w:ind w:left="720" w:hanging="360"/>
       </w:pPr>
     </w:lvl>
-    <w:lvl w:ilvl="1" w:tentative="1">
+    <w:lvl w:ilvl="1">
       <w:start w:val="1"/>
       <w:numFmt w:val="decimal"/>
       <w:lvlText w:val="%2."/>
@@ -5568,9 +5566,9 @@
     </w:lvl>
   </w:abstractNum>
   <w:abstractNum w:abstractNumId="2" w15:restartNumberingAfterBreak="0">
-    <w:nsid w:val="16A60FC1"/>
+    <w:nsid w:val="149A1A18"/>
     <w:multiLevelType w:val="multilevel"/>
-    <w:tmpl w:val="1C5EC36C"/>
+    <w:tmpl w:val="5E64A16E"/>
     <w:lvl w:ilvl="0">
       <w:start w:val="1"/>
       <w:numFmt w:val="decimal"/>
@@ -5583,7 +5581,7 @@
         <w:ind w:left="720" w:hanging="360"/>
       </w:pPr>
     </w:lvl>
-    <w:lvl w:ilvl="1">
+    <w:lvl w:ilvl="1" w:tentative="1">
       <w:start w:val="1"/>
       <w:numFmt w:val="decimal"/>
       <w:lvlText w:val="%2."/>
@@ -5681,9 +5679,9 @@
     </w:lvl>
   </w:abstractNum>
   <w:abstractNum w:abstractNumId="3" w15:restartNumberingAfterBreak="0">
-    <w:nsid w:val="40BF2DEF"/>
+    <w:nsid w:val="1ED20F8C"/>
     <w:multiLevelType w:val="multilevel"/>
-    <w:tmpl w:val="6B869458"/>
+    <w:tmpl w:val="5DD2D6E0"/>
     <w:lvl w:ilvl="0">
       <w:start w:val="1"/>
       <w:numFmt w:val="decimal"/>
@@ -5794,9 +5792,9 @@
     </w:lvl>
   </w:abstractNum>
   <w:abstractNum w:abstractNumId="4" w15:restartNumberingAfterBreak="0">
-    <w:nsid w:val="442B6334"/>
+    <w:nsid w:val="24A759BC"/>
     <w:multiLevelType w:val="multilevel"/>
-    <w:tmpl w:val="1C1E18F4"/>
+    <w:tmpl w:val="BAA26D26"/>
     <w:lvl w:ilvl="0">
       <w:start w:val="1"/>
       <w:numFmt w:val="decimal"/>
@@ -5809,7 +5807,7 @@
         <w:ind w:left="720" w:hanging="360"/>
       </w:pPr>
     </w:lvl>
-    <w:lvl w:ilvl="1" w:tentative="1">
+    <w:lvl w:ilvl="1">
       <w:start w:val="1"/>
       <w:numFmt w:val="decimal"/>
       <w:lvlText w:val="%2."/>
@@ -5907,9 +5905,9 @@
     </w:lvl>
   </w:abstractNum>
   <w:abstractNum w:abstractNumId="5" w15:restartNumberingAfterBreak="0">
-    <w:nsid w:val="48873275"/>
+    <w:nsid w:val="348D4F74"/>
     <w:multiLevelType w:val="multilevel"/>
-    <w:tmpl w:val="DEF63F46"/>
+    <w:tmpl w:val="1BF00B02"/>
     <w:lvl w:ilvl="0">
       <w:start w:val="1"/>
       <w:numFmt w:val="decimal"/>
@@ -6020,9 +6018,9 @@
     </w:lvl>
   </w:abstractNum>
   <w:abstractNum w:abstractNumId="6" w15:restartNumberingAfterBreak="0">
-    <w:nsid w:val="497843DB"/>
+    <w:nsid w:val="42ED50D9"/>
     <w:multiLevelType w:val="multilevel"/>
-    <w:tmpl w:val="B5F6111E"/>
+    <w:tmpl w:val="C95A3F9C"/>
     <w:lvl w:ilvl="0">
       <w:start w:val="1"/>
       <w:numFmt w:val="decimal"/>
@@ -6133,9 +6131,9 @@
     </w:lvl>
   </w:abstractNum>
   <w:abstractNum w:abstractNumId="7" w15:restartNumberingAfterBreak="0">
-    <w:nsid w:val="49C84176"/>
+    <w:nsid w:val="56386BF5"/>
     <w:multiLevelType w:val="multilevel"/>
-    <w:tmpl w:val="02A842C2"/>
+    <w:tmpl w:val="ABB4ABF0"/>
     <w:lvl w:ilvl="0">
       <w:start w:val="1"/>
       <w:numFmt w:val="decimal"/>
@@ -6246,9 +6244,9 @@
     </w:lvl>
   </w:abstractNum>
   <w:abstractNum w:abstractNumId="8" w15:restartNumberingAfterBreak="0">
-    <w:nsid w:val="4BA368DC"/>
+    <w:nsid w:val="58C12185"/>
     <w:multiLevelType w:val="multilevel"/>
-    <w:tmpl w:val="3ED4CBD2"/>
+    <w:tmpl w:val="58041760"/>
     <w:lvl w:ilvl="0">
       <w:start w:val="1"/>
       <w:numFmt w:val="decimal"/>
@@ -6359,9 +6357,9 @@
     </w:lvl>
   </w:abstractNum>
   <w:abstractNum w:abstractNumId="9" w15:restartNumberingAfterBreak="0">
-    <w:nsid w:val="58207B6A"/>
+    <w:nsid w:val="5BEF248D"/>
     <w:multiLevelType w:val="multilevel"/>
-    <w:tmpl w:val="ADA2BAC2"/>
+    <w:tmpl w:val="F55EC4FA"/>
     <w:lvl w:ilvl="0">
       <w:start w:val="1"/>
       <w:numFmt w:val="decimal"/>
@@ -6374,7 +6372,7 @@
         <w:ind w:left="720" w:hanging="360"/>
       </w:pPr>
     </w:lvl>
-    <w:lvl w:ilvl="1">
+    <w:lvl w:ilvl="1" w:tentative="1">
       <w:start w:val="1"/>
       <w:numFmt w:val="decimal"/>
       <w:lvlText w:val="%2."/>
@@ -6472,9 +6470,9 @@
     </w:lvl>
   </w:abstractNum>
   <w:abstractNum w:abstractNumId="10" w15:restartNumberingAfterBreak="0">
-    <w:nsid w:val="639C136B"/>
+    <w:nsid w:val="6EB73EC5"/>
     <w:multiLevelType w:val="multilevel"/>
-    <w:tmpl w:val="4B5424D8"/>
+    <w:tmpl w:val="8CBECB4E"/>
     <w:lvl w:ilvl="0">
       <w:start w:val="1"/>
       <w:numFmt w:val="decimal"/>
@@ -6585,9 +6583,9 @@
     </w:lvl>
   </w:abstractNum>
   <w:abstractNum w:abstractNumId="11" w15:restartNumberingAfterBreak="0">
-    <w:nsid w:val="70D60EA3"/>
+    <w:nsid w:val="76B307E7"/>
     <w:multiLevelType w:val="multilevel"/>
-    <w:tmpl w:val="46746182"/>
+    <w:tmpl w:val="C76C0BC8"/>
     <w:lvl w:ilvl="0">
       <w:start w:val="1"/>
       <w:numFmt w:val="decimal"/>
@@ -6698,9 +6696,9 @@
     </w:lvl>
   </w:abstractNum>
   <w:abstractNum w:abstractNumId="12" w15:restartNumberingAfterBreak="0">
-    <w:nsid w:val="7DB97373"/>
+    <w:nsid w:val="7B17731D"/>
     <w:multiLevelType w:val="multilevel"/>
-    <w:tmpl w:val="95F20C1E"/>
+    <w:tmpl w:val="C67AB6D0"/>
     <w:lvl w:ilvl="0">
       <w:start w:val="1"/>
       <w:numFmt w:val="decimal"/>
@@ -6810,44 +6808,44 @@
       </w:pPr>
     </w:lvl>
   </w:abstractNum>
-  <w:num w:numId="1" w16cid:durableId="769741781">
+  <w:num w:numId="1" w16cid:durableId="1246963774">
+    <w:abstractNumId w:val="5"/>
+  </w:num>
+  <w:num w:numId="2" w16cid:durableId="87048032">
     <w:abstractNumId w:val="3"/>
   </w:num>
-  <w:num w:numId="2" w16cid:durableId="2132938248">
+  <w:num w:numId="3" w16cid:durableId="1557663966">
+    <w:abstractNumId w:val="12"/>
+  </w:num>
+  <w:num w:numId="4" w16cid:durableId="543560470">
+    <w:abstractNumId w:val="8"/>
+  </w:num>
+  <w:num w:numId="5" w16cid:durableId="239796661">
+    <w:abstractNumId w:val="10"/>
+  </w:num>
+  <w:num w:numId="6" w16cid:durableId="1476949248">
+    <w:abstractNumId w:val="4"/>
+  </w:num>
+  <w:num w:numId="7" w16cid:durableId="1572278553">
     <w:abstractNumId w:val="6"/>
   </w:num>
-  <w:num w:numId="3" w16cid:durableId="970598766">
+  <w:num w:numId="8" w16cid:durableId="634794407">
+    <w:abstractNumId w:val="1"/>
+  </w:num>
+  <w:num w:numId="9" w16cid:durableId="1233127904">
     <w:abstractNumId w:val="0"/>
   </w:num>
-  <w:num w:numId="4" w16cid:durableId="1220899352">
-    <w:abstractNumId w:val="1"/>
+  <w:num w:numId="10" w16cid:durableId="781417175">
+    <w:abstractNumId w:val="11"/>
   </w:num>
-  <w:num w:numId="5" w16cid:durableId="2061636492">
-    <w:abstractNumId w:val="10"/>
+  <w:num w:numId="11" w16cid:durableId="327096797">
+    <w:abstractNumId w:val="9"/>
   </w:num>
-  <w:num w:numId="6" w16cid:durableId="1436485643">
-    <w:abstractNumId w:val="2"/>
-  </w:num>
-  <w:num w:numId="7" w16cid:durableId="1081100264">
+  <w:num w:numId="12" w16cid:durableId="1209534978">
     <w:abstractNumId w:val="7"/>
   </w:num>
-  <w:num w:numId="8" w16cid:durableId="267087157">
-    <w:abstractNumId w:val="9"/>
-  </w:num>
-  <w:num w:numId="9" w16cid:durableId="1814323748">
-    <w:abstractNumId w:val="8"/>
-  </w:num>
-  <w:num w:numId="10" w16cid:durableId="1959986155">
-    <w:abstractNumId w:val="5"/>
-  </w:num>
-  <w:num w:numId="11" w16cid:durableId="297690625">
-    <w:abstractNumId w:val="12"/>
-  </w:num>
-  <w:num w:numId="12" w16cid:durableId="202980997">
-    <w:abstractNumId w:val="11"/>
-  </w:num>
-  <w:num w:numId="13" w16cid:durableId="1667438965">
-    <w:abstractNumId w:val="4"/>
+  <w:num w:numId="13" w16cid:durableId="1050498140">
+    <w:abstractNumId w:val="2"/>
   </w:num>
 </w:numbering>
 </file>
@@ -7461,7 +7459,6 @@
     <w:name w:val="inkan"/>
     <w:basedOn w:val="a"/>
     <w:pPr>
-      <w:spacing w:before="420" w:after="100" w:afterAutospacing="1"/>
       <w:jc w:val="right"/>
     </w:pPr>
     <w:rPr>
@@ -7496,6 +7493,13 @@
       <w:spacing w:before="100" w:beforeAutospacing="1" w:after="100" w:afterAutospacing="1"/>
     </w:pPr>
   </w:style>
+  <w:style w:type="paragraph" w:customStyle="1" w:styleId="signer-row">
+    <w:name w:val="signer-row"/>
+    <w:basedOn w:val="a"/>
+    <w:pPr>
+      <w:spacing w:before="100" w:beforeAutospacing="1" w:after="100" w:afterAutospacing="1"/>
+    </w:pPr>
+  </w:style>
   <w:style w:type="paragraph" w:customStyle="1" w:styleId="ttl1">
     <w:name w:val="ttl1"/>
     <w:basedOn w:val="a"/>
@@ -7507,6 +7511,14 @@
       <w:b/>
       <w:bCs/>
     </w:rPr>
+  </w:style>
+  <w:style w:type="paragraph" w:customStyle="1" w:styleId="signer-row1">
+    <w:name w:val="signer-row1"/>
+    <w:basedOn w:val="a"/>
+    <w:pPr>
+      <w:spacing w:before="100" w:beforeAutospacing="1" w:after="60"/>
+      <w:jc w:val="both"/>
+    </w:pPr>
   </w:style>
   <w:style w:type="paragraph" w:customStyle="1" w:styleId="label1">
     <w:name w:val="label1"/>
@@ -7536,7 +7548,7 @@
     <w:link w:val="a5"/>
     <w:uiPriority w:val="99"/>
     <w:unhideWhenUsed/>
-    <w:rsid w:val="002A1E2F"/>
+    <w:rsid w:val="001A3B10"/>
     <w:pPr>
       <w:tabs>
         <w:tab w:val="center" w:pos="4252"/>
@@ -7550,7 +7562,7 @@
     <w:basedOn w:val="a0"/>
     <w:link w:val="a4"/>
     <w:uiPriority w:val="99"/>
-    <w:rsid w:val="002A1E2F"/>
+    <w:rsid w:val="001A3B10"/>
     <w:rPr>
       <w:rFonts w:ascii="ＭＳ Ｐゴシック" w:eastAsia="ＭＳ Ｐゴシック" w:hAnsi="ＭＳ Ｐゴシック" w:cs="ＭＳ Ｐゴシック"/>
       <w:sz w:val="24"/>
@@ -7563,7 +7575,7 @@
     <w:link w:val="a7"/>
     <w:uiPriority w:val="99"/>
     <w:unhideWhenUsed/>
-    <w:rsid w:val="002A1E2F"/>
+    <w:rsid w:val="001A3B10"/>
     <w:pPr>
       <w:tabs>
         <w:tab w:val="center" w:pos="4252"/>
@@ -7577,7 +7589,7 @@
     <w:basedOn w:val="a0"/>
     <w:link w:val="a6"/>
     <w:uiPriority w:val="99"/>
-    <w:rsid w:val="002A1E2F"/>
+    <w:rsid w:val="001A3B10"/>
     <w:rPr>
       <w:rFonts w:ascii="ＭＳ Ｐゴシック" w:eastAsia="ＭＳ Ｐゴシック" w:hAnsi="ＭＳ Ｐゴシック" w:cs="ＭＳ Ｐゴシック"/>
       <w:sz w:val="24"/>

</xml_diff>